<commit_message>
docs: add verified client captures to manuals
</commit_message>
<xml_diff>
--- a/TI.1.2. PAO202651_SOAP_DOTNET_SINBDD_NRC36884_GR09/05. DOCUMENTACION/02. MANUAL TECNICO/MANUAL_TECNICO_SOAP_DOTNET_SINBDD_NRC36884_GR09.docx
+++ b/TI.1.2. PAO202651_SOAP_DOTNET_SINBDD_NRC36884_GR09/05. DOCUMENTACION/02. MANUAL TECNICO/MANUAL_TECNICO_SOAP_DOTNET_SINBDD_NRC36884_GR09.docx
@@ -21870,35 +21870,42 @@
       <w:pPr>
         <w:keepNext/>
         <w:keepLines/>
-        <w:pBdr>
-          <w:top w:val="single" w:sz="4" w:space="1" w:color="D9D9D9"/>
-          <w:left w:val="single" w:sz="4" w:space="1" w:color="D9D9D9"/>
-          <w:bottom w:val="single" w:sz="4" w:space="1" w:color="D9D9D9"/>
-          <w:right w:val="single" w:sz="4" w:space="1" w:color="D9D9D9"/>
-        </w:pBdr>
-        <w:spacing w:before="1930" w:after="1930" w:line="240" w:lineRule="exact"/>
+        <w:spacing w:before="80" w:after="80"/>
         <w:jc w:val="center"/>
       </w:pPr>
-      <w:bookmarkStart w:id="106" w:name="_ravx3sp74jix" w:colFirst="0" w:colLast="0"/>
-      <w:bookmarkEnd w:id="106"/>
-      <w:r>
-        <w:rPr>
-          <w:rFonts w:ascii="Arial" w:hAnsi="Arial"/>
-          <w:i/>
-          <w:color w:val="666666"/>
-          <w:sz w:val="18"/>
-        </w:rPr>
-        <w:t>CAPTURA PENDIENTE</w:t>
-      </w:r>
-      <w:r>
-        <w:rPr>
-          <w:rFonts w:ascii="Arial" w:hAnsi="Arial"/>
-          <w:i/>
-          <w:color w:val="666666"/>
-          <w:sz w:val="18"/>
-        </w:rPr>
-        <w:br/>
-        <w:t>Login - Cliente web</w:t>
+      <w:r>
+        <w:drawing>
+          <wp:inline xmlns:a="http://schemas.openxmlformats.org/drawingml/2006/main" xmlns:pic="http://schemas.openxmlformats.org/drawingml/2006/picture">
+            <wp:extent cx="5166360" cy="4322052"/>
+            <wp:docPr id="56" name="Picture 56" descr="Captura real de acceso al cliente web para TI.1.2. PAO202651_SOAP_DOTNET_SINBDD_NRC36884_GR09"/>
+            <wp:cNvGraphicFramePr>
+              <a:graphicFrameLocks noChangeAspect="1"/>
+            </wp:cNvGraphicFramePr>
+            <a:graphic>
+              <a:graphicData uri="http://schemas.openxmlformats.org/drawingml/2006/picture">
+                <pic:pic>
+                  <pic:nvPicPr>
+                    <pic:cNvPr id="0" name="Figura_43_Login_CLIWEB_SOAP_DOTNET.jpg"/>
+                    <pic:cNvPicPr/>
+                  </pic:nvPicPr>
+                  <pic:blipFill>
+                    <a:blip r:embed="rId15"/>
+                    <a:stretch>
+                      <a:fillRect/>
+                    </a:stretch>
+                  </pic:blipFill>
+                  <pic:spPr>
+                    <a:xfrm>
+                      <a:off x="0" y="0"/>
+                      <a:ext cx="5166360" cy="4322052"/>
+                    </a:xfrm>
+                    <a:prstGeom prst="rect"/>
+                  </pic:spPr>
+                </pic:pic>
+              </a:graphicData>
+            </a:graphic>
+          </wp:inline>
+        </w:drawing>
       </w:r>
     </w:p>
     <w:p>
@@ -21915,33 +21922,42 @@
       <w:pPr>
         <w:keepNext/>
         <w:keepLines/>
-        <w:pBdr>
-          <w:top w:val="single" w:sz="4" w:space="1" w:color="D9D9D9"/>
-          <w:left w:val="single" w:sz="4" w:space="1" w:color="D9D9D9"/>
-          <w:bottom w:val="single" w:sz="4" w:space="1" w:color="D9D9D9"/>
-          <w:right w:val="single" w:sz="4" w:space="1" w:color="D9D9D9"/>
-        </w:pBdr>
-        <w:spacing w:before="1980" w:after="1980" w:line="240" w:lineRule="exact"/>
+        <w:spacing w:before="80" w:after="80"/>
         <w:jc w:val="center"/>
       </w:pPr>
       <w:r>
-        <w:rPr>
-          <w:rFonts w:ascii="Arial" w:hAnsi="Arial"/>
-          <w:i/>
-          <w:color w:val="666666"/>
-          <w:sz w:val="18"/>
-        </w:rPr>
-        <w:t>CAPTURA PENDIENTE</w:t>
-      </w:r>
-      <w:r>
-        <w:rPr>
-          <w:rFonts w:ascii="Arial" w:hAnsi="Arial"/>
-          <w:i/>
-          <w:color w:val="666666"/>
-          <w:sz w:val="18"/>
-        </w:rPr>
-        <w:br/>
-        <w:t>Pantalla de Conversiones - Cliente web</w:t>
+        <w:drawing>
+          <wp:inline xmlns:a="http://schemas.openxmlformats.org/drawingml/2006/main" xmlns:pic="http://schemas.openxmlformats.org/drawingml/2006/picture">
+            <wp:extent cx="4356690" cy="5029199"/>
+            <wp:docPr id="57" name="Picture 57" descr="Captura real de conversión de longitud en el cliente web para TI.1.2. PAO202651_SOAP_DOTNET_SINBDD_NRC36884_GR09"/>
+            <wp:cNvGraphicFramePr>
+              <a:graphicFrameLocks noChangeAspect="1"/>
+            </wp:cNvGraphicFramePr>
+            <a:graphic>
+              <a:graphicData uri="http://schemas.openxmlformats.org/drawingml/2006/picture">
+                <pic:pic>
+                  <pic:nvPicPr>
+                    <pic:cNvPr id="0" name="Figura_44_Conversion_Longitud_CLIWEB_SOAP_DOTNET.jpg"/>
+                    <pic:cNvPicPr/>
+                  </pic:nvPicPr>
+                  <pic:blipFill>
+                    <a:blip r:embed="rId16"/>
+                    <a:stretch>
+                      <a:fillRect/>
+                    </a:stretch>
+                  </pic:blipFill>
+                  <pic:spPr>
+                    <a:xfrm>
+                      <a:off x="0" y="0"/>
+                      <a:ext cx="4356690" cy="5029199"/>
+                    </a:xfrm>
+                    <a:prstGeom prst="rect"/>
+                  </pic:spPr>
+                </pic:pic>
+              </a:graphicData>
+            </a:graphic>
+          </wp:inline>
+        </w:drawing>
       </w:r>
     </w:p>
     <w:p>

</xml_diff>